<commit_message>
Add string input and redesign showcase
</commit_message>
<xml_diff>
--- a/docs/TS2068_BASIC_Users_Manual_Formatted.docx
+++ b/docs/TS2068_BASIC_Users_Manual_Formatted.docx
@@ -5202,25 +5202,34 @@
           </w:tcPr>
           <w:p>
             <w:r>
-              <w:t xml:space="preserve">Blocks, echoing digits (and an optional leading </w:t>
+              <w:t xml:space="preserve">Reads a numeric scalar or string scalar. </w:t>
             </w:r>
             <w:r>
               <w:rPr>
                 <w:rStyle w:val="CodeInline"/>
               </w:rPr>
+              <w:t>INPUT N</w:t>
+            </w:r>
+            <w:r>
+              <w:t xml:space="preserve"> accepts digits and an optional </w:t>
+            </w:r>
+            <w:r>
+              <w:rPr>
+                <w:rStyle w:val="CodeInline"/>
+              </w:rPr>
               <w:t>-</w:t>
             </w:r>
             <w:r>
-              <w:t xml:space="preserve">) as you type, until ENTER, then stores the number into a </w:t>
-            </w:r>
-            <w:r>
-              <w:rPr>
-                <w:b/>
-              </w:rPr>
-              <w:t>numeric</w:t>
-            </w:r>
-            <w:r>
-              <w:t xml:space="preserve"> variable. No backspace during input yet — an unrecognized key (including DELETE) is silently ignored</w:t>
+              <w:t xml:space="preserve">; </w:t>
+            </w:r>
+            <w:r>
+              <w:rPr>
+                <w:rStyle w:val="CodeInline"/>
+              </w:rPr>
+              <w:t>INPUT N$</w:t>
+            </w:r>
+            <w:r>
+              <w:t xml:space="preserve"> accepts up to 31 printable characters. ENTER commits the value. Unrecognized keys (including DELETE) are ignored</w:t>
             </w:r>
           </w:p>
         </w:tc>
@@ -5341,16 +5350,7 @@
         <w:t>INPUT</w:t>
       </w:r>
       <w:r>
-        <w:t xml:space="preserve"> currently only reads into a plain numeric variable — no string </w:t>
-      </w:r>
-      <w:r>
-        <w:rPr>
-          <w:rStyle w:val="CodeInline"/>
-        </w:rPr>
-        <w:t>INPUT</w:t>
-      </w:r>
-      <w:r>
-        <w:t>, no prompt-string form (</w:t>
+        <w:t xml:space="preserve"> reads either a numeric or string scalar. A prompt-string form (</w:t>
       </w:r>
       <w:r>
         <w:rPr>
@@ -5359,7 +5359,7 @@
         <w:t>INPUT "Name: "; A$</w:t>
       </w:r>
       <w:r>
-        <w:t>).</w:t>
+        <w:t>) is not yet implemented; print the prompt first.</w:t>
       </w:r>
     </w:p>
     <w:p>
@@ -11738,9 +11738,20 @@
         <w:rPr>
           <w:b/>
         </w:rPr>
-        <w:t>No `INPUT` for strings, and no prompt-string form.</w:t>
-      </w:r>
-      <w:r/>
+        <w:t>No prompt-string form for `INPUT`.</w:t>
+      </w:r>
+      <w:r>
+        <w:t xml:space="preserve"> Print a prompt immediately before </w:t>
+      </w:r>
+      <w:r>
+        <w:rPr>
+          <w:rStyle w:val="CodeInline"/>
+        </w:rPr>
+        <w:t>INPUT</w:t>
+      </w:r>
+      <w:r>
+        <w:t xml:space="preserve"> instead.</w:t>
+      </w:r>
     </w:p>
     <w:p>
       <w:pPr>

</xml_diff>

<commit_message>
Add string arrays to BASIC
</commit_message>
<xml_diff>
--- a/docs/TS2068_BASIC_Users_Manual_Formatted.docx
+++ b/docs/TS2068_BASIC_Users_Manual_Formatted.docx
@@ -352,7 +352,7 @@
         <w:t>WHEN ERRor</w:t>
       </w:r>
       <w:r>
-        <w:t>, string arrays) that aren't built yet. Anything described here as working has been checked against the code that implements it. See "Known limitations" at the end for what's deliberately left out.</w:t>
+        <w:t>) that aren't built yet. Anything described here as working has been checked against the code that implements it. See "Known limitations" at the end for what's deliberately left out.</w:t>
       </w:r>
     </w:p>
     <w:p>
@@ -451,7 +451,7 @@
         <w:pStyle w:val="ListBullet"/>
       </w:pPr>
       <w:r>
-        <w:t>Numeric arrays, scalar strings, string functions, pixel graphics, sprites, collision detection, AY sound, High Resolution Graphics colour, and ULAplus palettes are accessible directly from BASIC.</w:t>
+        <w:t>Numeric and string arrays, scalar strings, string functions, pixel graphics, sprites, collision detection, AY sound, High Resolution Graphics colour, and ULAplus palettes are accessible directly from BASIC.</w:t>
       </w:r>
     </w:p>
     <w:p>
@@ -2881,7 +2881,16 @@
         <w:t>n</w:t>
       </w:r>
       <w:r>
-        <w:t xml:space="preserve"> zero-initialized elements, indexed </w:t>
+        <w:t xml:space="preserve"> zero-initialized elements. </w:t>
+      </w:r>
+      <w:r>
+        <w:rPr>
+          <w:rStyle w:val="CodeInline"/>
+        </w:rPr>
+        <w:t>DIM name$(n)</w:t>
+      </w:r>
+      <w:r>
+        <w:t xml:space="preserve"> declares up to 31 string elements, each able to hold 31 characters. Both are indexed </w:t>
       </w:r>
       <w:r>
         <w:rPr>
@@ -2899,7 +2908,16 @@
         <w:t>name(i)</w:t>
       </w:r>
       <w:r>
-        <w:t xml:space="preserve"> reads or writes one element, and can nest (</w:t>
+        <w:t xml:space="preserve"> or </w:t>
+      </w:r>
+      <w:r>
+        <w:rPr>
+          <w:rStyle w:val="CodeInline"/>
+        </w:rPr>
+        <w:t>name$(i)</w:t>
+      </w:r>
+      <w:r>
+        <w:t xml:space="preserve"> reads or writes one element, and numeric references can nest (</w:t>
       </w:r>
       <w:r>
         <w:rPr>
@@ -2912,6 +2930,21 @@
       </w:r>
     </w:p>
     <w:p>
+      <w:pPr>
+        <w:pStyle w:val="CodeBlock"/>
+        <w:shd w:fill="F2F4F7"/>
+      </w:pPr>
+      <w:r>
+        <w:t>DIM colour$(3)</w:t>
+        <w:br/>
+        <w:t>colour$(0) = "RED"</w:t>
+        <w:br/>
+        <w:t>colour$(1) = UPPER$("blue")</w:t>
+        <w:br/>
+        <w:t>PRINT colour$(1)</w:t>
+      </w:r>
+    </w:p>
+    <w:p>
       <w:r>
         <w:t xml:space="preserve">A name can only be </w:t>
       </w:r>
@@ -3024,16 +3057,16 @@
         <w:t>DIMN(name)</w:t>
       </w:r>
       <w:r>
-        <w:t xml:space="preserve"> returns an array's declared size — useful for looping over it without hardcoding the length: </w:t>
+        <w:t xml:space="preserve"> returns a numeric array's declared size; use </w:t>
       </w:r>
       <w:r>
         <w:rPr>
           <w:rStyle w:val="CodeInline"/>
         </w:rPr>
-        <w:t>FOR i = 0 TO DIMN(scores)-1</w:t>
-      </w:r>
-      <w:r>
-        <w:t>.</w:t>
+        <w:t>DIMN(name$)</w:t>
+      </w:r>
+      <w:r>
+        <w:t xml:space="preserve"> for a string array.</w:t>
       </w:r>
     </w:p>
     <w:p>
@@ -3052,16 +3085,7 @@
     </w:p>
     <w:p>
       <w:r>
-        <w:t xml:space="preserve">There's no </w:t>
-      </w:r>
-      <w:r>
-        <w:rPr>
-          <w:rStyle w:val="CodeInline"/>
-        </w:rPr>
-        <w:t>DIM name$(n)</w:t>
-      </w:r>
-      <w:r>
-        <w:t xml:space="preserve"> string-array support yet, and no multi-dimensional (</w:t>
+        <w:t>There is no multi-dimensional (</w:t>
       </w:r>
       <w:r>
         <w:rPr>
@@ -11725,9 +11749,11 @@
         <w:rPr>
           <w:b/>
         </w:rPr>
-        <w:t>No string arrays, no multi-dimensional arrays.</w:t>
-      </w:r>
-      <w:r/>
+        <w:t>No multi-dimensional arrays.</w:t>
+      </w:r>
+      <w:r>
+        <w:t xml:space="preserve"> Numeric and string arrays are one-dimensional.</w:t>
+      </w:r>
     </w:p>
     <w:p>
       <w:pPr>

</xml_diff>